<commit_message>
AX platform: build report v2 (soak, retrain automation, validation catch)
Co-Authored-By: Claude Fable 5 <noreply@anthropic.com>
Claude-Session: https://claude.ai/code/session_01FbQP7AjAZoRwNRDcTdAboQ
</commit_message>
<xml_diff>
--- a/docs/presentations/AX_Platform_Build_Report.docx
+++ b/docs/presentations/AX_Platform_Build_Report.docx
@@ -352,7 +352,7 @@
                 <w:sz w:val="19"/>
                 <w:szCs w:val="19"/>
               </w:rPr>
-              <w:t xml:space="preserve">모듈 8개(M0~M7) · Python 코어 30여 파일 · 데이터 계약 7건 · 단위시험 19건 통과</w:t>
+              <w:t xml:space="preserve">모듈 8개(M0~M7) + 운영 자동화 · Python 코어 40여 파일 · 데이터 계약 7건 · 단위시험 23건 통과</w:t>
             </w:r>
           </w:p>
         </w:tc>
@@ -414,7 +414,7 @@
                 <w:sz w:val="19"/>
                 <w:szCs w:val="19"/>
               </w:rPr>
-              <w:t xml:space="preserve">합성 데이터 생성→수집→표준화→학습→그래프→판단 카드→승인→환류까지 한 명령, 72초</w:t>
+              <w:t xml:space="preserve">합성 데이터 생성→수집→표준화→학습→그래프→판단 카드→승인→환류까지 한 명령, 87초(설비예지 포함)</w:t>
             </w:r>
           </w:p>
         </w:tc>
@@ -600,7 +600,7 @@
                 <w:sz w:val="19"/>
                 <w:szCs w:val="19"/>
               </w:rPr>
-              <w:t xml:space="preserve">고장 1건을 13일 선행 감지 (recall 1.0, 경보일 비율 9%)</w:t>
+              <w:t xml:space="preserve">고장 1건을 13일 선행 감지 (recall 1.0) — 경보일 점검 카드 승인·환류까지 E2E 편입</w:t>
             </w:r>
           </w:p>
         </w:tc>
@@ -787,6 +787,192 @@
                 <w:szCs w:val="19"/>
               </w:rPr>
               <w:t xml:space="preserve">6영역(정합·품질·모델·판단·커스터디·자립) 전부 자동 점검 통과</w:t>
+            </w:r>
+          </w:p>
+        </w:tc>
+      </w:tr>
+      <w:tr>
+        <w:tc>
+          <w:tcPr>
+            <w:tcW w:type="dxa" w:w="3300"/>
+            <w:shd w:fill="F8F2EA" w:val="clear"/>
+            <w:tcMar>
+              <w:top w:type="dxa" w:w="80"/>
+              <w:left w:type="dxa" w:w="110"/>
+              <w:bottom w:type="dxa" w:w="80"/>
+              <w:right w:type="dxa" w:w="110"/>
+            </w:tcMar>
+            <w:vAlign w:val="center"/>
+          </w:tcPr>
+          <w:p>
+            <w:pPr>
+              <w:spacing w:line="290"/>
+              <w:jc w:val="left"/>
+            </w:pPr>
+            <w:r>
+              <w:rPr>
+                <w:rFonts w:ascii="Malgun Gothic" w:cs="Malgun Gothic" w:eastAsia="Malgun Gothic" w:hAnsi="Malgun Gothic"/>
+                <w:b/>
+                <w:bCs/>
+                <w:color w:val="6E3A1C"/>
+                <w:sz w:val="19"/>
+                <w:szCs w:val="19"/>
+              </w:rPr>
+              <w:t xml:space="preserve">12일 소크 운전</w:t>
+            </w:r>
+          </w:p>
+        </w:tc>
+        <w:tc>
+          <w:tcPr>
+            <w:tcW w:type="dxa" w:w="6446"/>
+            <w:shd w:fill="F8F2EA" w:val="clear"/>
+            <w:tcMar>
+              <w:top w:type="dxa" w:w="80"/>
+              <w:left w:type="dxa" w:w="110"/>
+              <w:bottom w:type="dxa" w:w="80"/>
+              <w:right w:type="dxa" w:w="110"/>
+            </w:tcMar>
+            <w:vAlign w:val="center"/>
+          </w:tcPr>
+          <w:p>
+            <w:pPr>
+              <w:spacing w:line="290"/>
+              <w:jc w:val="left"/>
+            </w:pPr>
+            <w:r>
+              <w:rPr>
+                <w:rFonts w:ascii="Malgun Gothic" w:cs="Malgun Gothic" w:eastAsia="Malgun Gothic" w:hAnsi="Malgun Gothic"/>
+                <w:b w:val="false"/>
+                <w:bCs w:val="false"/>
+                <w:color w:val="2E241C"/>
+                <w:sz w:val="19"/>
+                <w:szCs w:val="19"/>
+              </w:rPr>
+              <w:t xml:space="preserve">야간 사이클 12회 무오류 · 카드 99건 · 승급 자동 실행 21건(상한·감사 로그) · 강등 감시 정상</w:t>
+            </w:r>
+          </w:p>
+        </w:tc>
+      </w:tr>
+      <w:tr>
+        <w:tc>
+          <w:tcPr>
+            <w:tcW w:type="dxa" w:w="3300"/>
+            <w:shd w:fill="FFFFFF" w:val="clear"/>
+            <w:tcMar>
+              <w:top w:type="dxa" w:w="80"/>
+              <w:left w:type="dxa" w:w="110"/>
+              <w:bottom w:type="dxa" w:w="80"/>
+              <w:right w:type="dxa" w:w="110"/>
+            </w:tcMar>
+            <w:vAlign w:val="center"/>
+          </w:tcPr>
+          <w:p>
+            <w:pPr>
+              <w:spacing w:line="290"/>
+              <w:jc w:val="left"/>
+            </w:pPr>
+            <w:r>
+              <w:rPr>
+                <w:rFonts w:ascii="Malgun Gothic" w:cs="Malgun Gothic" w:eastAsia="Malgun Gothic" w:hAnsi="Malgun Gothic"/>
+                <w:b/>
+                <w:bCs/>
+                <w:color w:val="6E3A1C"/>
+                <w:sz w:val="19"/>
+                <w:szCs w:val="19"/>
+              </w:rPr>
+              <w:t xml:space="preserve">재학습 자동화(OP-3)</w:t>
+            </w:r>
+          </w:p>
+        </w:tc>
+        <w:tc>
+          <w:tcPr>
+            <w:tcW w:type="dxa" w:w="6446"/>
+            <w:shd w:fill="FFFFFF" w:val="clear"/>
+            <w:tcMar>
+              <w:top w:type="dxa" w:w="80"/>
+              <w:left w:type="dxa" w:w="110"/>
+              <w:bottom w:type="dxa" w:w="80"/>
+              <w:right w:type="dxa" w:w="110"/>
+            </w:tcMar>
+            <w:vAlign w:val="center"/>
+          </w:tcPr>
+          <w:p>
+            <w:pPr>
+              <w:spacing w:line="290"/>
+              <w:jc w:val="left"/>
+            </w:pPr>
+            <w:r>
+              <w:rPr>
+                <w:rFonts w:ascii="Malgun Gothic" w:cs="Malgun Gothic" w:eastAsia="Malgun Gothic" w:hAnsi="Malgun Gothic"/>
+                <w:b w:val="false"/>
+                <w:bCs w:val="false"/>
+                <w:color w:val="2E241C"/>
+                <w:sz w:val="19"/>
+                <w:szCs w:val="19"/>
+              </w:rPr>
+              <w:t xml:space="preserve">드리프트/WAPE 하한 판정→재학습→그림자 비교→승격 게이트: v2가 7.0% vs 7.8%로 승격(불통과 시 롤백)</w:t>
+            </w:r>
+          </w:p>
+        </w:tc>
+      </w:tr>
+      <w:tr>
+        <w:tc>
+          <w:tcPr>
+            <w:tcW w:type="dxa" w:w="3300"/>
+            <w:shd w:fill="F8F2EA" w:val="clear"/>
+            <w:tcMar>
+              <w:top w:type="dxa" w:w="80"/>
+              <w:left w:type="dxa" w:w="110"/>
+              <w:bottom w:type="dxa" w:w="80"/>
+              <w:right w:type="dxa" w:w="110"/>
+            </w:tcMar>
+            <w:vAlign w:val="center"/>
+          </w:tcPr>
+          <w:p>
+            <w:pPr>
+              <w:spacing w:line="290"/>
+              <w:jc w:val="left"/>
+            </w:pPr>
+            <w:r>
+              <w:rPr>
+                <w:rFonts w:ascii="Malgun Gothic" w:cs="Malgun Gothic" w:eastAsia="Malgun Gothic" w:hAnsi="Malgun Gothic"/>
+                <w:b/>
+                <w:bCs/>
+                <w:color w:val="6E3A1C"/>
+                <w:sz w:val="19"/>
+                <w:szCs w:val="19"/>
+              </w:rPr>
+              <w:t xml:space="preserve">교차 원천 검증</w:t>
+            </w:r>
+          </w:p>
+        </w:tc>
+        <w:tc>
+          <w:tcPr>
+            <w:tcW w:type="dxa" w:w="6446"/>
+            <w:shd w:fill="F8F2EA" w:val="clear"/>
+            <w:tcMar>
+              <w:top w:type="dxa" w:w="80"/>
+              <w:left w:type="dxa" w:w="110"/>
+              <w:bottom w:type="dxa" w:w="80"/>
+              <w:right w:type="dxa" w:w="110"/>
+            </w:tcMar>
+            <w:vAlign w:val="center"/>
+          </w:tcPr>
+          <w:p>
+            <w:pPr>
+              <w:spacing w:line="290"/>
+              <w:jc w:val="left"/>
+            </w:pPr>
+            <w:r>
+              <w:rPr>
+                <w:rFonts w:ascii="Malgun Gothic" w:cs="Malgun Gothic" w:eastAsia="Malgun Gothic" w:hAnsi="Malgun Gothic"/>
+                <w:b w:val="false"/>
+                <w:bCs w:val="false"/>
+                <w:color w:val="2E241C"/>
+                <w:sz w:val="19"/>
+                <w:szCs w:val="19"/>
+              </w:rPr>
+              <w:t xml:space="preserve">엑셀 대 원장 대조가 잘못된 격리 확정(코드 사전 오염)을 실제로 적발 — 수정 후 120건 전부 일치</w:t>
             </w:r>
           </w:p>
         </w:tc>
@@ -1655,7 +1841,7 @@
                 <w:sz w:val="19"/>
                 <w:szCs w:val="19"/>
               </w:rPr>
-              <w:t xml:space="preserve">런타임(이력·경보), 기본 에이전트 5종(명세 선언), HITL 승인함(권한 분리·감사 로그·환류), 승급 워크플로(자동 반려·강등), War Room</w:t>
+              <w:t xml:space="preserve">런타임(이력·경보), 기본 에이전트 5종(명세 선언), HITL 승인함(권한 분리·감사 로그·환류), 승급 워크플로(자동 반려·강등·자동 실행), War Room</w:t>
             </w:r>
           </w:p>
         </w:tc>
@@ -1685,7 +1871,99 @@
                 <w:sz w:val="19"/>
                 <w:szCs w:val="19"/>
               </w:rPr>
-              <w:t xml:space="preserve">권한 없는 승인 403 · 승인→파라미터 환류·감사 추적 · 승인율 미달 자동 반려</w:t>
+              <w:t xml:space="preserve">권한 없는 승인 403 · 승인→파라미터 환류·감사 추적 · 상한 이내만 자동 실행</w:t>
+            </w:r>
+          </w:p>
+        </w:tc>
+      </w:tr>
+      <w:tr>
+        <w:tc>
+          <w:tcPr>
+            <w:tcW w:type="dxa" w:w="1650"/>
+            <w:shd w:fill="F8F2EA" w:val="clear"/>
+            <w:tcMar>
+              <w:top w:type="dxa" w:w="80"/>
+              <w:left w:type="dxa" w:w="110"/>
+              <w:bottom w:type="dxa" w:w="80"/>
+              <w:right w:type="dxa" w:w="110"/>
+            </w:tcMar>
+            <w:vAlign w:val="center"/>
+          </w:tcPr>
+          <w:p>
+            <w:pPr>
+              <w:spacing w:line="290"/>
+              <w:jc w:val="left"/>
+            </w:pPr>
+            <w:r>
+              <w:rPr>
+                <w:rFonts w:ascii="Malgun Gothic" w:cs="Malgun Gothic" w:eastAsia="Malgun Gothic" w:hAnsi="Malgun Gothic"/>
+                <w:b/>
+                <w:bCs/>
+                <w:color w:val="6E3A1C"/>
+                <w:sz w:val="19"/>
+                <w:szCs w:val="19"/>
+              </w:rPr>
+              <w:t xml:space="preserve">운영 자동화</w:t>
+            </w:r>
+          </w:p>
+        </w:tc>
+        <w:tc>
+          <w:tcPr>
+            <w:tcW w:type="dxa" w:w="4550"/>
+            <w:shd w:fill="F8F2EA" w:val="clear"/>
+            <w:tcMar>
+              <w:top w:type="dxa" w:w="80"/>
+              <w:left w:type="dxa" w:w="110"/>
+              <w:bottom w:type="dxa" w:w="80"/>
+              <w:right w:type="dxa" w:w="110"/>
+            </w:tcMar>
+            <w:vAlign w:val="center"/>
+          </w:tcPr>
+          <w:p>
+            <w:pPr>
+              <w:spacing w:line="290"/>
+              <w:jc w:val="left"/>
+            </w:pPr>
+            <w:r>
+              <w:rPr>
+                <w:rFonts w:ascii="Malgun Gothic" w:cs="Malgun Gothic" w:eastAsia="Malgun Gothic" w:hAnsi="Malgun Gothic"/>
+                <w:b w:val="false"/>
+                <w:bCs w:val="false"/>
+                <w:color w:val="2E241C"/>
+                <w:sz w:val="19"/>
+                <w:szCs w:val="19"/>
+              </w:rPr>
+              <w:t xml:space="preserve">야간 스케줄러 18단계, 주간 재학습(OP-3) 자동화, 교차 원천 검증, Parquet 개방 포맷 내보내기, 지식센터 씨앗(메모 급증→후보), 근거 역추적 HTML, 스튜어드 CLI, Odoo 승인함 애드온 스켈레톤, n8n 게이트 워크플로, Superset 자산 정의</w:t>
+            </w:r>
+          </w:p>
+        </w:tc>
+        <w:tc>
+          <w:tcPr>
+            <w:tcW w:type="dxa" w:w="3546"/>
+            <w:shd w:fill="F8F2EA" w:val="clear"/>
+            <w:tcMar>
+              <w:top w:type="dxa" w:w="80"/>
+              <w:left w:type="dxa" w:w="110"/>
+              <w:bottom w:type="dxa" w:w="80"/>
+              <w:right w:type="dxa" w:w="110"/>
+            </w:tcMar>
+            <w:vAlign w:val="center"/>
+          </w:tcPr>
+          <w:p>
+            <w:pPr>
+              <w:spacing w:line="290"/>
+              <w:jc w:val="left"/>
+            </w:pPr>
+            <w:r>
+              <w:rPr>
+                <w:rFonts w:ascii="Malgun Gothic" w:cs="Malgun Gothic" w:eastAsia="Malgun Gothic" w:hAnsi="Malgun Gothic"/>
+                <w:b w:val="false"/>
+                <w:bCs w:val="false"/>
+                <w:color w:val="2E241C"/>
+                <w:sz w:val="19"/>
+                <w:szCs w:val="19"/>
+              </w:rPr>
+              <w:t xml:space="preserve">월요일 사이클 18단계 무오류 · 시험 23건</w:t>
             </w:r>
           </w:p>
         </w:tc>
@@ -3224,6 +3502,109 @@
         <w:tblW w:type="dxa" w:w="9746"/>
         <w:tblBorders>
           <w:top w:val="single" w:color="DCCDBB" w:sz="4"/>
+          <w:left w:val="single" w:color="A8493B" w:sz="22"/>
+          <w:bottom w:val="single" w:color="DCCDBB" w:sz="4"/>
+          <w:right w:val="single" w:color="DCCDBB" w:sz="4"/>
+          <w:insideH w:val="none" w:color="FFFFFF" w:sz="0"/>
+          <w:insideV w:val="none" w:color="FFFFFF" w:sz="0"/>
+        </w:tblBorders>
+      </w:tblPr>
+      <w:tblGrid>
+        <w:gridCol w:w="9746"/>
+      </w:tblGrid>
+      <w:tr>
+        <w:tc>
+          <w:tcPr>
+            <w:tcW w:type="dxa" w:w="9746"/>
+            <w:shd w:fill="F8F2EA" w:val="clear"/>
+            <w:tcMar>
+              <w:top w:type="dxa" w:w="120"/>
+              <w:left w:type="dxa" w:w="180"/>
+              <w:bottom w:type="dxa" w:w="120"/>
+              <w:right w:type="dxa" w:w="160"/>
+            </w:tcMar>
+          </w:tcPr>
+          <w:p>
+            <w:pPr>
+              <w:spacing w:after="60" w:line="300"/>
+            </w:pPr>
+            <w:r>
+              <w:rPr>
+                <w:rFonts w:ascii="Malgun Gothic" w:cs="Malgun Gothic" w:eastAsia="Malgun Gothic" w:hAnsi="Malgun Gothic"/>
+                <w:b/>
+                <w:bCs/>
+                <w:color w:val="C07F1E"/>
+                <w:sz w:val="20"/>
+                <w:szCs w:val="20"/>
+              </w:rPr>
+              <w:t xml:space="preserve">I-09  </w:t>
+            </w:r>
+            <w:r>
+              <w:rPr>
+                <w:rFonts w:ascii="Malgun Gothic" w:cs="Malgun Gothic" w:eastAsia="Malgun Gothic" w:hAnsi="Malgun Gothic"/>
+                <w:b/>
+                <w:bCs/>
+                <w:color w:val="2E241C"/>
+                <w:sz w:val="21"/>
+                <w:szCs w:val="21"/>
+              </w:rPr>
+              <w:t xml:space="preserve">잘못된 스튜어드 확정이 하류를 오염 — 교차 검증이 적발</w:t>
+            </w:r>
+          </w:p>
+          <w:p>
+            <w:pPr>
+              <w:spacing w:after="60" w:line="300"/>
+            </w:pPr>
+            <w:r>
+              <w:rPr>
+                <w:rFonts w:ascii="Malgun Gothic" w:cs="Malgun Gothic" w:eastAsia="Malgun Gothic" w:hAnsi="Malgun Gothic"/>
+                <w:color w:val="2E241C"/>
+                <w:sz w:val="19"/>
+                <w:szCs w:val="19"/>
+              </w:rPr>
+              <w:t xml:space="preserve">E2E 시연 코드가 격리 큐 첫 건을 무조건 'P-PIE'로 확정해 코드 사전이 오염됐고, 엑셀 판매집계 검증에서 P-PIE 수량이 원장의 1.6배로 15건 불일치했습니다. 새로 만든 교차 원천 검증 잡이 첫 실행에서 이를 적발했고, 확정 로직 수정 후 120건 전부 일치로 회복 — 검증 잡은 야간 배치에 상설 편입했습니다.</w:t>
+            </w:r>
+          </w:p>
+          <w:p>
+            <w:pPr>
+              <w:spacing w:after="0" w:line="300"/>
+            </w:pPr>
+            <w:r>
+              <w:rPr>
+                <w:rFonts w:ascii="Malgun Gothic" w:cs="Malgun Gothic" w:eastAsia="Malgun Gothic" w:hAnsi="Malgun Gothic"/>
+                <w:b/>
+                <w:bCs/>
+                <w:color w:val="0E8F86"/>
+                <w:sz w:val="19"/>
+                <w:szCs w:val="19"/>
+              </w:rPr>
+              <w:t xml:space="preserve">교훈  </w:t>
+            </w:r>
+            <w:r>
+              <w:rPr>
+                <w:rFonts w:ascii="Malgun Gothic" w:cs="Malgun Gothic" w:eastAsia="Malgun Gothic" w:hAnsi="Malgun Gothic"/>
+                <w:i/>
+                <w:iCs/>
+                <w:color w:val="76675A"/>
+                <w:sz w:val="19"/>
+                <w:szCs w:val="19"/>
+              </w:rPr>
+              <w:t xml:space="preserve">격리 확정 실수는 반드시 일어난다 — 교차 검증이 확정의 감사자다.</w:t>
+            </w:r>
+          </w:p>
+        </w:tc>
+      </w:tr>
+    </w:tbl>
+    <w:p>
+      <w:pPr>
+        <w:spacing w:after="110"/>
+      </w:pPr>
+    </w:p>
+    <w:tbl>
+      <w:tblPr>
+        <w:tblW w:type="dxa" w:w="9746"/>
+        <w:tblBorders>
+          <w:top w:val="single" w:color="DCCDBB" w:sz="4"/>
           <w:left w:val="single" w:color="9C5227" w:sz="22"/>
           <w:bottom w:val="single" w:color="DCCDBB" w:sz="4"/>
           <w:right w:val="single" w:color="DCCDBB" w:sz="4"/>
@@ -4792,7 +5173,7 @@
                 <w:sz w:val="19"/>
                 <w:szCs w:val="19"/>
               </w:rPr>
-              <w:t xml:space="preserve">단위 시험 19건</w:t>
+              <w:t xml:space="preserve">단위 시험 23건</w:t>
             </w:r>
           </w:p>
         </w:tc>
@@ -4854,7 +5235,7 @@
                 <w:sz w:val="19"/>
                 <w:szCs w:val="19"/>
               </w:rPr>
-              <w:t xml:space="preserve">War Room·승인함 API</w:t>
+              <w:t xml:space="preserve">스튜어드 콘솔</w:t>
             </w:r>
           </w:p>
         </w:tc>
@@ -4884,7 +5265,7 @@
                 <w:sz w:val="19"/>
                 <w:szCs w:val="19"/>
               </w:rPr>
-              <w:t xml:space="preserve">uvicorn axp.api:app --app-dir core --port 8000</w:t>
+              <w:t xml:space="preserve">PYTHONPATH=core python -m axp.cli cards / approve / quarantine / ask</w:t>
             </w:r>
           </w:p>
         </w:tc>
@@ -4916,7 +5297,7 @@
                 <w:sz w:val="19"/>
                 <w:szCs w:val="19"/>
               </w:rPr>
-              <w:t xml:space="preserve">아침 브리핑·보드</w:t>
+              <w:t xml:space="preserve">근거 역추적 화면</w:t>
             </w:r>
           </w:p>
         </w:tc>
@@ -4946,7 +5327,7 @@
                 <w:sz w:val="19"/>
                 <w:szCs w:val="19"/>
               </w:rPr>
-              <w:t xml:space="preserve">demo/out/artifacts/ (briefings·boards·eda)</w:t>
+              <w:t xml:space="preserve">demo/out/artifacts/evidence/why_RULE-*.html (API: /rules/{id}/why)</w:t>
             </w:r>
           </w:p>
         </w:tc>
@@ -4978,7 +5359,7 @@
                 <w:sz w:val="19"/>
                 <w:szCs w:val="19"/>
               </w:rPr>
-              <w:t xml:space="preserve">이슈 원장(전체)</w:t>
+              <w:t xml:space="preserve">야간 배치 1사이클</w:t>
             </w:r>
           </w:p>
         </w:tc>
@@ -5008,7 +5389,7 @@
                 <w:sz w:val="19"/>
                 <w:szCs w:val="19"/>
               </w:rPr>
-              <w:t xml:space="preserve">ax-platform/ISSUES.md</w:t>
+              <w:t xml:space="preserve">python -c "from axp.scheduler import run_cycle; run_cycle('&lt;날짜&gt;')"</w:t>
             </w:r>
           </w:p>
         </w:tc>
@@ -5040,6 +5421,192 @@
                 <w:sz w:val="19"/>
                 <w:szCs w:val="19"/>
               </w:rPr>
+              <w:t xml:space="preserve">War Room·승인함 API</w:t>
+            </w:r>
+          </w:p>
+        </w:tc>
+        <w:tc>
+          <w:tcPr>
+            <w:tcW w:type="dxa" w:w="5946"/>
+            <w:shd w:fill="F8F2EA" w:val="clear"/>
+            <w:tcMar>
+              <w:top w:type="dxa" w:w="80"/>
+              <w:left w:type="dxa" w:w="110"/>
+              <w:bottom w:type="dxa" w:w="80"/>
+              <w:right w:type="dxa" w:w="110"/>
+            </w:tcMar>
+            <w:vAlign w:val="center"/>
+          </w:tcPr>
+          <w:p>
+            <w:pPr>
+              <w:spacing w:line="290"/>
+              <w:jc w:val="left"/>
+            </w:pPr>
+            <w:r>
+              <w:rPr>
+                <w:rFonts w:ascii="Malgun Gothic" w:cs="Malgun Gothic" w:eastAsia="Malgun Gothic" w:hAnsi="Malgun Gothic"/>
+                <w:b w:val="false"/>
+                <w:bCs w:val="false"/>
+                <w:color w:val="2E241C"/>
+                <w:sz w:val="19"/>
+                <w:szCs w:val="19"/>
+              </w:rPr>
+              <w:t xml:space="preserve">uvicorn axp.api:app --app-dir core --port 8000</w:t>
+            </w:r>
+          </w:p>
+        </w:tc>
+      </w:tr>
+      <w:tr>
+        <w:tc>
+          <w:tcPr>
+            <w:tcW w:type="dxa" w:w="3800"/>
+            <w:shd w:fill="FFFFFF" w:val="clear"/>
+            <w:tcMar>
+              <w:top w:type="dxa" w:w="80"/>
+              <w:left w:type="dxa" w:w="110"/>
+              <w:bottom w:type="dxa" w:w="80"/>
+              <w:right w:type="dxa" w:w="110"/>
+            </w:tcMar>
+            <w:vAlign w:val="center"/>
+          </w:tcPr>
+          <w:p>
+            <w:pPr>
+              <w:spacing w:line="290"/>
+              <w:jc w:val="left"/>
+            </w:pPr>
+            <w:r>
+              <w:rPr>
+                <w:rFonts w:ascii="Malgun Gothic" w:cs="Malgun Gothic" w:eastAsia="Malgun Gothic" w:hAnsi="Malgun Gothic"/>
+                <w:b/>
+                <w:bCs/>
+                <w:color w:val="6E3A1C"/>
+                <w:sz w:val="19"/>
+                <w:szCs w:val="19"/>
+              </w:rPr>
+              <w:t xml:space="preserve">아침 브리핑·보드</w:t>
+            </w:r>
+          </w:p>
+        </w:tc>
+        <w:tc>
+          <w:tcPr>
+            <w:tcW w:type="dxa" w:w="5946"/>
+            <w:shd w:fill="FFFFFF" w:val="clear"/>
+            <w:tcMar>
+              <w:top w:type="dxa" w:w="80"/>
+              <w:left w:type="dxa" w:w="110"/>
+              <w:bottom w:type="dxa" w:w="80"/>
+              <w:right w:type="dxa" w:w="110"/>
+            </w:tcMar>
+            <w:vAlign w:val="center"/>
+          </w:tcPr>
+          <w:p>
+            <w:pPr>
+              <w:spacing w:line="290"/>
+              <w:jc w:val="left"/>
+            </w:pPr>
+            <w:r>
+              <w:rPr>
+                <w:rFonts w:ascii="Malgun Gothic" w:cs="Malgun Gothic" w:eastAsia="Malgun Gothic" w:hAnsi="Malgun Gothic"/>
+                <w:b w:val="false"/>
+                <w:bCs w:val="false"/>
+                <w:color w:val="2E241C"/>
+                <w:sz w:val="19"/>
+                <w:szCs w:val="19"/>
+              </w:rPr>
+              <w:t xml:space="preserve">demo/out/artifacts/ (briefings·boards·eda)</w:t>
+            </w:r>
+          </w:p>
+        </w:tc>
+      </w:tr>
+      <w:tr>
+        <w:tc>
+          <w:tcPr>
+            <w:tcW w:type="dxa" w:w="3800"/>
+            <w:shd w:fill="F8F2EA" w:val="clear"/>
+            <w:tcMar>
+              <w:top w:type="dxa" w:w="80"/>
+              <w:left w:type="dxa" w:w="110"/>
+              <w:bottom w:type="dxa" w:w="80"/>
+              <w:right w:type="dxa" w:w="110"/>
+            </w:tcMar>
+            <w:vAlign w:val="center"/>
+          </w:tcPr>
+          <w:p>
+            <w:pPr>
+              <w:spacing w:line="290"/>
+              <w:jc w:val="left"/>
+            </w:pPr>
+            <w:r>
+              <w:rPr>
+                <w:rFonts w:ascii="Malgun Gothic" w:cs="Malgun Gothic" w:eastAsia="Malgun Gothic" w:hAnsi="Malgun Gothic"/>
+                <w:b/>
+                <w:bCs/>
+                <w:color w:val="6E3A1C"/>
+                <w:sz w:val="19"/>
+                <w:szCs w:val="19"/>
+              </w:rPr>
+              <w:t xml:space="preserve">이슈 원장(전체)</w:t>
+            </w:r>
+          </w:p>
+        </w:tc>
+        <w:tc>
+          <w:tcPr>
+            <w:tcW w:type="dxa" w:w="5946"/>
+            <w:shd w:fill="F8F2EA" w:val="clear"/>
+            <w:tcMar>
+              <w:top w:type="dxa" w:w="80"/>
+              <w:left w:type="dxa" w:w="110"/>
+              <w:bottom w:type="dxa" w:w="80"/>
+              <w:right w:type="dxa" w:w="110"/>
+            </w:tcMar>
+            <w:vAlign w:val="center"/>
+          </w:tcPr>
+          <w:p>
+            <w:pPr>
+              <w:spacing w:line="290"/>
+              <w:jc w:val="left"/>
+            </w:pPr>
+            <w:r>
+              <w:rPr>
+                <w:rFonts w:ascii="Malgun Gothic" w:cs="Malgun Gothic" w:eastAsia="Malgun Gothic" w:hAnsi="Malgun Gothic"/>
+                <w:b w:val="false"/>
+                <w:bCs w:val="false"/>
+                <w:color w:val="2E241C"/>
+                <w:sz w:val="19"/>
+                <w:szCs w:val="19"/>
+              </w:rPr>
+              <w:t xml:space="preserve">ax-platform/ISSUES.md</w:t>
+            </w:r>
+          </w:p>
+        </w:tc>
+      </w:tr>
+      <w:tr>
+        <w:tc>
+          <w:tcPr>
+            <w:tcW w:type="dxa" w:w="3800"/>
+            <w:shd w:fill="FFFFFF" w:val="clear"/>
+            <w:tcMar>
+              <w:top w:type="dxa" w:w="80"/>
+              <w:left w:type="dxa" w:w="110"/>
+              <w:bottom w:type="dxa" w:w="80"/>
+              <w:right w:type="dxa" w:w="110"/>
+            </w:tcMar>
+            <w:vAlign w:val="center"/>
+          </w:tcPr>
+          <w:p>
+            <w:pPr>
+              <w:spacing w:line="290"/>
+              <w:jc w:val="left"/>
+            </w:pPr>
+            <w:r>
+              <w:rPr>
+                <w:rFonts w:ascii="Malgun Gothic" w:cs="Malgun Gothic" w:eastAsia="Malgun Gothic" w:hAnsi="Malgun Gothic"/>
+                <w:b/>
+                <w:bCs/>
+                <w:color w:val="6E3A1C"/>
+                <w:sz w:val="19"/>
+                <w:szCs w:val="19"/>
+              </w:rPr>
               <w:t xml:space="preserve">게이트 문서</w:t>
             </w:r>
           </w:p>
@@ -5047,7 +5614,7 @@
         <w:tc>
           <w:tcPr>
             <w:tcW w:type="dxa" w:w="5946"/>
-            <w:shd w:fill="F8F2EA" w:val="clear"/>
+            <w:shd w:fill="FFFFFF" w:val="clear"/>
             <w:tcMar>
               <w:top w:type="dxa" w:w="80"/>
               <w:left w:type="dxa" w:w="110"/>

</xml_diff>

<commit_message>
AX platform: final build report v3
Final numbers: phase-2/3 expansions, 14-day soak (95 cards, 42
auto-executed), all five risks green, 27 tests; issue ledger through
I-11 with lessons; pointers to demo script, onboarding guide and
performance notes.

Co-Authored-By: Claude Fable 5 <noreply@anthropic.com>
Claude-Session: https://claude.ai/code/session_01FbQP7AjAZoRwNRDcTdAboQ
</commit_message>
<xml_diff>
--- a/docs/presentations/AX_Platform_Build_Report.docx
+++ b/docs/presentations/AX_Platform_Build_Report.docx
@@ -52,7 +52,7 @@
           <w:sz w:val="30"/>
           <w:szCs w:val="30"/>
         </w:rPr>
-        <w:t xml:space="preserve">10시간 자율 구축 — 결과 · 검증 · 이슈 · 남은 현장 작업</w:t>
+        <w:t xml:space="preserve">자율 구축(연장 포함 16시간) — 결과 · 검증 · 이슈 · 남은 현장 작업 [최종판 v3]</w:t>
       </w:r>
     </w:p>
     <w:p>
@@ -352,7 +352,7 @@
                 <w:sz w:val="19"/>
                 <w:szCs w:val="19"/>
               </w:rPr>
-              <w:t xml:space="preserve">모듈 8개(M0~M7) + 운영 자동화 · Python 코어 40여 파일 · 데이터 계약 7건 · 단위시험 23건 통과</w:t>
+              <w:t xml:space="preserve">모듈 8개(M0~M7) + 운영 자동화 + 2·3단계 확장 · Python 코어 45여 파일 · 데이터 계약 7건 · 단위시험 27건 통과</w:t>
             </w:r>
           </w:p>
         </w:tc>
@@ -818,7 +818,7 @@
                 <w:sz w:val="19"/>
                 <w:szCs w:val="19"/>
               </w:rPr>
-              <w:t xml:space="preserve">12일 소크 운전</w:t>
+              <w:t xml:space="preserve">14일 최종 소크</w:t>
             </w:r>
           </w:p>
         </w:tc>
@@ -848,7 +848,131 @@
                 <w:sz w:val="19"/>
                 <w:szCs w:val="19"/>
               </w:rPr>
-              <w:t xml:space="preserve">야간 사이클 12회 무오류 · 카드 99건 · 승급 자동 실행 21건(상한·감사 로그) · 강등 감시 정상</w:t>
+              <w:t xml:space="preserve">야간 사이클 14회 무오류 · 카드 95건 · 승급 자동 실행 42건(상한·감사 로그 근거) · 리스크 5 전부 🟢</w:t>
+            </w:r>
+          </w:p>
+        </w:tc>
+      </w:tr>
+      <w:tr>
+        <w:tc>
+          <w:tcPr>
+            <w:tcW w:type="dxa" w:w="3300"/>
+            <w:shd w:fill="FFFFFF" w:val="clear"/>
+            <w:tcMar>
+              <w:top w:type="dxa" w:w="80"/>
+              <w:left w:type="dxa" w:w="110"/>
+              <w:bottom w:type="dxa" w:w="80"/>
+              <w:right w:type="dxa" w:w="110"/>
+            </w:tcMar>
+            <w:vAlign w:val="center"/>
+          </w:tcPr>
+          <w:p>
+            <w:pPr>
+              <w:spacing w:line="290"/>
+              <w:jc w:val="left"/>
+            </w:pPr>
+            <w:r>
+              <w:rPr>
+                <w:rFonts w:ascii="Malgun Gothic" w:cs="Malgun Gothic" w:eastAsia="Malgun Gothic" w:hAnsi="Malgun Gothic"/>
+                <w:b/>
+                <w:bCs/>
+                <w:color w:val="6E3A1C"/>
+                <w:sz w:val="19"/>
+                <w:szCs w:val="19"/>
+              </w:rPr>
+              <w:t xml:space="preserve">2단계 수평 확장</w:t>
+            </w:r>
+          </w:p>
+        </w:tc>
+        <w:tc>
+          <w:tcPr>
+            <w:tcW w:type="dxa" w:w="6446"/>
+            <w:shd w:fill="FFFFFF" w:val="clear"/>
+            <w:tcMar>
+              <w:top w:type="dxa" w:w="80"/>
+              <w:left w:type="dxa" w:w="110"/>
+              <w:bottom w:type="dxa" w:w="80"/>
+              <w:right w:type="dxa" w:w="110"/>
+            </w:tcMar>
+            <w:vAlign w:val="center"/>
+          </w:tcPr>
+          <w:p>
+            <w:pPr>
+              <w:spacing w:line="290"/>
+              <w:jc w:val="left"/>
+            </w:pPr>
+            <w:r>
+              <w:rPr>
+                <w:rFonts w:ascii="Malgun Gothic" w:cs="Malgun Gothic" w:eastAsia="Malgun Gothic" w:hAnsi="Malgun Gothic"/>
+                <w:b w:val="false"/>
+                <w:bCs w:val="false"/>
+                <w:color w:val="2E241C"/>
+                <w:sz w:val="19"/>
+                <w:szCs w:val="19"/>
+              </w:rPr>
+              <w:t xml:space="preserve">생산계획 에이전트(6호, 라인 용량 감안) · 연속 경보→계획 정비 승격 · 정상 설비 오경보율 1.1%(특이도)</w:t>
+            </w:r>
+          </w:p>
+        </w:tc>
+      </w:tr>
+      <w:tr>
+        <w:tc>
+          <w:tcPr>
+            <w:tcW w:type="dxa" w:w="3300"/>
+            <w:shd w:fill="F8F2EA" w:val="clear"/>
+            <w:tcMar>
+              <w:top w:type="dxa" w:w="80"/>
+              <w:left w:type="dxa" w:w="110"/>
+              <w:bottom w:type="dxa" w:w="80"/>
+              <w:right w:type="dxa" w:w="110"/>
+            </w:tcMar>
+            <w:vAlign w:val="center"/>
+          </w:tcPr>
+          <w:p>
+            <w:pPr>
+              <w:spacing w:line="290"/>
+              <w:jc w:val="left"/>
+            </w:pPr>
+            <w:r>
+              <w:rPr>
+                <w:rFonts w:ascii="Malgun Gothic" w:cs="Malgun Gothic" w:eastAsia="Malgun Gothic" w:hAnsi="Malgun Gothic"/>
+                <w:b/>
+                <w:bCs/>
+                <w:color w:val="6E3A1C"/>
+                <w:sz w:val="19"/>
+                <w:szCs w:val="19"/>
+              </w:rPr>
+              <w:t xml:space="preserve">3단계 지능 심화</w:t>
+            </w:r>
+          </w:p>
+        </w:tc>
+        <w:tc>
+          <w:tcPr>
+            <w:tcW w:type="dxa" w:w="6446"/>
+            <w:shd w:fill="F8F2EA" w:val="clear"/>
+            <w:tcMar>
+              <w:top w:type="dxa" w:w="80"/>
+              <w:left w:type="dxa" w:w="110"/>
+              <w:bottom w:type="dxa" w:w="80"/>
+              <w:right w:type="dxa" w:w="110"/>
+            </w:tcMar>
+            <w:vAlign w:val="center"/>
+          </w:tcPr>
+          <w:p>
+            <w:pPr>
+              <w:spacing w:line="290"/>
+              <w:jc w:val="left"/>
+            </w:pPr>
+            <w:r>
+              <w:rPr>
+                <w:rFonts w:ascii="Malgun Gothic" w:cs="Malgun Gothic" w:eastAsia="Malgun Gothic" w:hAnsi="Malgun Gothic"/>
+                <w:b w:val="false"/>
+                <w:bCs w:val="false"/>
+                <w:color w:val="2E241C"/>
+                <w:sz w:val="19"/>
+                <w:szCs w:val="19"/>
+              </w:rPr>
+              <w:t xml:space="preserve">Rule 2건 승격 → SOP 개정 제안 카드(지식→절차) · 메모 급증 키워드→원인 후보(기저 대비 lift 검증)</w:t>
             </w:r>
           </w:p>
         </w:tc>
@@ -3537,6 +3661,212 @@
                 <w:sz w:val="20"/>
                 <w:szCs w:val="20"/>
               </w:rPr>
+              <w:t xml:space="preserve">I-11  </w:t>
+            </w:r>
+            <w:r>
+              <w:rPr>
+                <w:rFonts w:ascii="Malgun Gothic" w:cs="Malgun Gothic" w:eastAsia="Malgun Gothic" w:hAnsi="Malgun Gothic"/>
+                <w:b/>
+                <w:bCs/>
+                <w:color w:val="2E241C"/>
+                <w:sz w:val="21"/>
+                <w:szCs w:val="21"/>
+              </w:rPr>
+              <w:t xml:space="preserve">확신도 루프의 처리 순서 함정 — 시간이 곧 논리다</w:t>
+            </w:r>
+          </w:p>
+          <w:p>
+            <w:pPr>
+              <w:spacing w:after="60" w:line="300"/>
+            </w:pPr>
+            <w:r>
+              <w:rPr>
+                <w:rFonts w:ascii="Malgun Gothic" w:cs="Malgun Gothic" w:eastAsia="Malgun Gothic" w:hAnsi="Malgun Gothic"/>
+                <w:color w:val="2E241C"/>
+                <w:sz w:val="19"/>
+                <w:szCs w:val="19"/>
+              </w:rPr>
+              <w:t xml:space="preserve">후보를 성능(z) 내림차순으로 처리하자 늦은 관측 창이 먼저 들어가 이른 창이 '가까운 과거'로 오인, 독립 확인 3회가 2회로 줄어 핵심 규칙(OVEN-2×V2)이 승격 임계에 못 미쳤습니다. 관측 창 시간순 처리로 수정 — 두 규칙 모두 정상 승격되고, SOP 개정 제안이 더 구체적인 조합을 겨냥하게 됐습니다. 재발 방지 시험 3건 추가.</w:t>
+            </w:r>
+          </w:p>
+          <w:p>
+            <w:pPr>
+              <w:spacing w:after="0" w:line="300"/>
+            </w:pPr>
+            <w:r>
+              <w:rPr>
+                <w:rFonts w:ascii="Malgun Gothic" w:cs="Malgun Gothic" w:eastAsia="Malgun Gothic" w:hAnsi="Malgun Gothic"/>
+                <w:b/>
+                <w:bCs/>
+                <w:color w:val="0E8F86"/>
+                <w:sz w:val="19"/>
+                <w:szCs w:val="19"/>
+              </w:rPr>
+              <w:t xml:space="preserve">교훈  </w:t>
+            </w:r>
+            <w:r>
+              <w:rPr>
+                <w:rFonts w:ascii="Malgun Gothic" w:cs="Malgun Gothic" w:eastAsia="Malgun Gothic" w:hAnsi="Malgun Gothic"/>
+                <w:i/>
+                <w:iCs/>
+                <w:color w:val="76675A"/>
+                <w:sz w:val="19"/>
+                <w:szCs w:val="19"/>
+              </w:rPr>
+              <w:t xml:space="preserve">시간이 의미를 갖는 루프에서는 정렬 기준을 성능이 아니라 시간에 둔다.</w:t>
+            </w:r>
+          </w:p>
+        </w:tc>
+      </w:tr>
+    </w:tbl>
+    <w:p>
+      <w:pPr>
+        <w:spacing w:after="110"/>
+      </w:pPr>
+    </w:p>
+    <w:tbl>
+      <w:tblPr>
+        <w:tblW w:type="dxa" w:w="9746"/>
+        <w:tblBorders>
+          <w:top w:val="single" w:color="DCCDBB" w:sz="4"/>
+          <w:left w:val="single" w:color="A8493B" w:sz="22"/>
+          <w:bottom w:val="single" w:color="DCCDBB" w:sz="4"/>
+          <w:right w:val="single" w:color="DCCDBB" w:sz="4"/>
+          <w:insideH w:val="none" w:color="FFFFFF" w:sz="0"/>
+          <w:insideV w:val="none" w:color="FFFFFF" w:sz="0"/>
+        </w:tblBorders>
+      </w:tblPr>
+      <w:tblGrid>
+        <w:gridCol w:w="9746"/>
+      </w:tblGrid>
+      <w:tr>
+        <w:tc>
+          <w:tcPr>
+            <w:tcW w:type="dxa" w:w="9746"/>
+            <w:shd w:fill="F8F2EA" w:val="clear"/>
+            <w:tcMar>
+              <w:top w:type="dxa" w:w="120"/>
+              <w:left w:type="dxa" w:w="180"/>
+              <w:bottom w:type="dxa" w:w="120"/>
+              <w:right w:type="dxa" w:w="160"/>
+            </w:tcMar>
+          </w:tcPr>
+          <w:p>
+            <w:pPr>
+              <w:spacing w:after="60" w:line="300"/>
+            </w:pPr>
+            <w:r>
+              <w:rPr>
+                <w:rFonts w:ascii="Malgun Gothic" w:cs="Malgun Gothic" w:eastAsia="Malgun Gothic" w:hAnsi="Malgun Gothic"/>
+                <w:b/>
+                <w:bCs/>
+                <w:color w:val="C07F1E"/>
+                <w:sz w:val="20"/>
+                <w:szCs w:val="20"/>
+              </w:rPr>
+              <w:t xml:space="preserve">I-10  </w:t>
+            </w:r>
+            <w:r>
+              <w:rPr>
+                <w:rFonts w:ascii="Malgun Gothic" w:cs="Malgun Gothic" w:eastAsia="Malgun Gothic" w:hAnsi="Malgun Gothic"/>
+                <w:b/>
+                <w:bCs/>
+                <w:color w:val="2E241C"/>
+                <w:sz w:val="21"/>
+                <w:szCs w:val="21"/>
+              </w:rPr>
+              <w:t xml:space="preserve">리스크 자동 점검이 격리 큐 적체 1,072행을 적발</w:t>
+            </w:r>
+          </w:p>
+          <w:p>
+            <w:pPr>
+              <w:spacing w:after="60" w:line="300"/>
+            </w:pPr>
+            <w:r>
+              <w:rPr>
+                <w:rFonts w:ascii="Malgun Gothic" w:cs="Malgun Gothic" w:eastAsia="Malgun Gothic" w:hAnsi="Malgun Gothic"/>
+                <w:color w:val="2E241C"/>
+                <w:sz w:val="19"/>
+                <w:szCs w:val="19"/>
+              </w:rPr>
+              <w:t xml:space="preserve">표준 코드와 완전 일치하는 별칭까지 격리로 보내고 일일 검증이 매일 재적재해 큐가 부풀었습니다. 완전 일치 별칭은 자동 매핑(auto 확정자 기록)으로 바꾸고 큐를 일괄 정리 — 대기 0행, 미매핑 0.09%. 프로모션 달력은 현실처럼 제품'명' 기입으로 바꿔 스튜어드 확정 흐름을 진짜 데이터로 시연합니다.</w:t>
+            </w:r>
+          </w:p>
+          <w:p>
+            <w:pPr>
+              <w:spacing w:after="0" w:line="300"/>
+            </w:pPr>
+            <w:r>
+              <w:rPr>
+                <w:rFonts w:ascii="Malgun Gothic" w:cs="Malgun Gothic" w:eastAsia="Malgun Gothic" w:hAnsi="Malgun Gothic"/>
+                <w:b/>
+                <w:bCs/>
+                <w:color w:val="0E8F86"/>
+                <w:sz w:val="19"/>
+                <w:szCs w:val="19"/>
+              </w:rPr>
+              <w:t xml:space="preserve">교훈  </w:t>
+            </w:r>
+            <w:r>
+              <w:rPr>
+                <w:rFonts w:ascii="Malgun Gothic" w:cs="Malgun Gothic" w:eastAsia="Malgun Gothic" w:hAnsi="Malgun Gothic"/>
+                <w:i/>
+                <w:iCs/>
+                <w:color w:val="76675A"/>
+                <w:sz w:val="19"/>
+                <w:szCs w:val="19"/>
+              </w:rPr>
+              <w:t xml:space="preserve">자동화할 수 있는 확정(완전 일치)은 자동화하고, 사람은 애매한 것만 본다.</w:t>
+            </w:r>
+          </w:p>
+        </w:tc>
+      </w:tr>
+    </w:tbl>
+    <w:p>
+      <w:pPr>
+        <w:spacing w:after="110"/>
+      </w:pPr>
+    </w:p>
+    <w:tbl>
+      <w:tblPr>
+        <w:tblW w:type="dxa" w:w="9746"/>
+        <w:tblBorders>
+          <w:top w:val="single" w:color="DCCDBB" w:sz="4"/>
+          <w:left w:val="single" w:color="A8493B" w:sz="22"/>
+          <w:bottom w:val="single" w:color="DCCDBB" w:sz="4"/>
+          <w:right w:val="single" w:color="DCCDBB" w:sz="4"/>
+          <w:insideH w:val="none" w:color="FFFFFF" w:sz="0"/>
+          <w:insideV w:val="none" w:color="FFFFFF" w:sz="0"/>
+        </w:tblBorders>
+      </w:tblPr>
+      <w:tblGrid>
+        <w:gridCol w:w="9746"/>
+      </w:tblGrid>
+      <w:tr>
+        <w:tc>
+          <w:tcPr>
+            <w:tcW w:type="dxa" w:w="9746"/>
+            <w:shd w:fill="F8F2EA" w:val="clear"/>
+            <w:tcMar>
+              <w:top w:type="dxa" w:w="120"/>
+              <w:left w:type="dxa" w:w="180"/>
+              <w:bottom w:type="dxa" w:w="120"/>
+              <w:right w:type="dxa" w:w="160"/>
+            </w:tcMar>
+          </w:tcPr>
+          <w:p>
+            <w:pPr>
+              <w:spacing w:after="60" w:line="300"/>
+            </w:pPr>
+            <w:r>
+              <w:rPr>
+                <w:rFonts w:ascii="Malgun Gothic" w:cs="Malgun Gothic" w:eastAsia="Malgun Gothic" w:hAnsi="Malgun Gothic"/>
+                <w:b/>
+                <w:bCs/>
+                <w:color w:val="C07F1E"/>
+                <w:sz w:val="20"/>
+                <w:szCs w:val="20"/>
+              </w:rPr>
               <w:t xml:space="preserve">I-09  </w:t>
             </w:r>
             <w:r>
@@ -5514,6 +5844,254 @@
                 <w:szCs w:val="19"/>
               </w:rPr>
               <w:t xml:space="preserve">demo/out/artifacts/ (briefings·boards·eda)</w:t>
+            </w:r>
+          </w:p>
+        </w:tc>
+      </w:tr>
+      <w:tr>
+        <w:tc>
+          <w:tcPr>
+            <w:tcW w:type="dxa" w:w="3800"/>
+            <w:shd w:fill="F8F2EA" w:val="clear"/>
+            <w:tcMar>
+              <w:top w:type="dxa" w:w="80"/>
+              <w:left w:type="dxa" w:w="110"/>
+              <w:bottom w:type="dxa" w:w="80"/>
+              <w:right w:type="dxa" w:w="110"/>
+            </w:tcMar>
+            <w:vAlign w:val="center"/>
+          </w:tcPr>
+          <w:p>
+            <w:pPr>
+              <w:spacing w:line="290"/>
+              <w:jc w:val="left"/>
+            </w:pPr>
+            <w:r>
+              <w:rPr>
+                <w:rFonts w:ascii="Malgun Gothic" w:cs="Malgun Gothic" w:eastAsia="Malgun Gothic" w:hAnsi="Malgun Gothic"/>
+                <w:b/>
+                <w:bCs/>
+                <w:color w:val="6E3A1C"/>
+                <w:sz w:val="19"/>
+                <w:szCs w:val="19"/>
+              </w:rPr>
+              <w:t xml:space="preserve">승인함 웹 화면</w:t>
+            </w:r>
+          </w:p>
+        </w:tc>
+        <w:tc>
+          <w:tcPr>
+            <w:tcW w:type="dxa" w:w="5946"/>
+            <w:shd w:fill="F8F2EA" w:val="clear"/>
+            <w:tcMar>
+              <w:top w:type="dxa" w:w="80"/>
+              <w:left w:type="dxa" w:w="110"/>
+              <w:bottom w:type="dxa" w:w="80"/>
+              <w:right w:type="dxa" w:w="110"/>
+            </w:tcMar>
+            <w:vAlign w:val="center"/>
+          </w:tcPr>
+          <w:p>
+            <w:pPr>
+              <w:spacing w:line="290"/>
+              <w:jc w:val="left"/>
+            </w:pPr>
+            <w:r>
+              <w:rPr>
+                <w:rFonts w:ascii="Malgun Gothic" w:cs="Malgun Gothic" w:eastAsia="Malgun Gothic" w:hAnsi="Malgun Gothic"/>
+                <w:b w:val="false"/>
+                <w:bCs w:val="false"/>
+                <w:color w:val="2E241C"/>
+                <w:sz w:val="19"/>
+                <w:szCs w:val="19"/>
+              </w:rPr>
+              <w:t xml:space="preserve">http://&lt;서버&gt;:8000/inbox (역할 전환·403 시연 포함)</w:t>
+            </w:r>
+          </w:p>
+        </w:tc>
+      </w:tr>
+      <w:tr>
+        <w:tc>
+          <w:tcPr>
+            <w:tcW w:type="dxa" w:w="3800"/>
+            <w:shd w:fill="FFFFFF" w:val="clear"/>
+            <w:tcMar>
+              <w:top w:type="dxa" w:w="80"/>
+              <w:left w:type="dxa" w:w="110"/>
+              <w:bottom w:type="dxa" w:w="80"/>
+              <w:right w:type="dxa" w:w="110"/>
+            </w:tcMar>
+            <w:vAlign w:val="center"/>
+          </w:tcPr>
+          <w:p>
+            <w:pPr>
+              <w:spacing w:line="290"/>
+              <w:jc w:val="left"/>
+            </w:pPr>
+            <w:r>
+              <w:rPr>
+                <w:rFonts w:ascii="Malgun Gothic" w:cs="Malgun Gothic" w:eastAsia="Malgun Gothic" w:hAnsi="Malgun Gothic"/>
+                <w:b/>
+                <w:bCs/>
+                <w:color w:val="6E3A1C"/>
+                <w:sz w:val="19"/>
+                <w:szCs w:val="19"/>
+              </w:rPr>
+              <w:t xml:space="preserve">10분 시연 대본</w:t>
+            </w:r>
+          </w:p>
+        </w:tc>
+        <w:tc>
+          <w:tcPr>
+            <w:tcW w:type="dxa" w:w="5946"/>
+            <w:shd w:fill="FFFFFF" w:val="clear"/>
+            <w:tcMar>
+              <w:top w:type="dxa" w:w="80"/>
+              <w:left w:type="dxa" w:w="110"/>
+              <w:bottom w:type="dxa" w:w="80"/>
+              <w:right w:type="dxa" w:w="110"/>
+            </w:tcMar>
+            <w:vAlign w:val="center"/>
+          </w:tcPr>
+          <w:p>
+            <w:pPr>
+              <w:spacing w:line="290"/>
+              <w:jc w:val="left"/>
+            </w:pPr>
+            <w:r>
+              <w:rPr>
+                <w:rFonts w:ascii="Malgun Gothic" w:cs="Malgun Gothic" w:eastAsia="Malgun Gothic" w:hAnsi="Malgun Gothic"/>
+                <w:b w:val="false"/>
+                <w:bCs w:val="false"/>
+                <w:color w:val="2E241C"/>
+                <w:sz w:val="19"/>
+                <w:szCs w:val="19"/>
+              </w:rPr>
+              <w:t xml:space="preserve">ax-platform/docs/demo-script.md</w:t>
+            </w:r>
+          </w:p>
+        </w:tc>
+      </w:tr>
+      <w:tr>
+        <w:tc>
+          <w:tcPr>
+            <w:tcW w:type="dxa" w:w="3800"/>
+            <w:shd w:fill="F8F2EA" w:val="clear"/>
+            <w:tcMar>
+              <w:top w:type="dxa" w:w="80"/>
+              <w:left w:type="dxa" w:w="110"/>
+              <w:bottom w:type="dxa" w:w="80"/>
+              <w:right w:type="dxa" w:w="110"/>
+            </w:tcMar>
+            <w:vAlign w:val="center"/>
+          </w:tcPr>
+          <w:p>
+            <w:pPr>
+              <w:spacing w:line="290"/>
+              <w:jc w:val="left"/>
+            </w:pPr>
+            <w:r>
+              <w:rPr>
+                <w:rFonts w:ascii="Malgun Gothic" w:cs="Malgun Gothic" w:eastAsia="Malgun Gothic" w:hAnsi="Malgun Gothic"/>
+                <w:b/>
+                <w:bCs/>
+                <w:color w:val="6E3A1C"/>
+                <w:sz w:val="19"/>
+                <w:szCs w:val="19"/>
+              </w:rPr>
+              <w:t xml:space="preserve">온보딩 준비서</w:t>
+            </w:r>
+          </w:p>
+        </w:tc>
+        <w:tc>
+          <w:tcPr>
+            <w:tcW w:type="dxa" w:w="5946"/>
+            <w:shd w:fill="F8F2EA" w:val="clear"/>
+            <w:tcMar>
+              <w:top w:type="dxa" w:w="80"/>
+              <w:left w:type="dxa" w:w="110"/>
+              <w:bottom w:type="dxa" w:w="80"/>
+              <w:right w:type="dxa" w:w="110"/>
+            </w:tcMar>
+            <w:vAlign w:val="center"/>
+          </w:tcPr>
+          <w:p>
+            <w:pPr>
+              <w:spacing w:line="290"/>
+              <w:jc w:val="left"/>
+            </w:pPr>
+            <w:r>
+              <w:rPr>
+                <w:rFonts w:ascii="Malgun Gothic" w:cs="Malgun Gothic" w:eastAsia="Malgun Gothic" w:hAnsi="Malgun Gothic"/>
+                <w:b w:val="false"/>
+                <w:bCs w:val="false"/>
+                <w:color w:val="2E241C"/>
+                <w:sz w:val="19"/>
+                <w:szCs w:val="19"/>
+              </w:rPr>
+              <w:t xml:space="preserve">ax-platform/docs/onboarding-first-customer.md</w:t>
+            </w:r>
+          </w:p>
+        </w:tc>
+      </w:tr>
+      <w:tr>
+        <w:tc>
+          <w:tcPr>
+            <w:tcW w:type="dxa" w:w="3800"/>
+            <w:shd w:fill="FFFFFF" w:val="clear"/>
+            <w:tcMar>
+              <w:top w:type="dxa" w:w="80"/>
+              <w:left w:type="dxa" w:w="110"/>
+              <w:bottom w:type="dxa" w:w="80"/>
+              <w:right w:type="dxa" w:w="110"/>
+            </w:tcMar>
+            <w:vAlign w:val="center"/>
+          </w:tcPr>
+          <w:p>
+            <w:pPr>
+              <w:spacing w:line="290"/>
+              <w:jc w:val="left"/>
+            </w:pPr>
+            <w:r>
+              <w:rPr>
+                <w:rFonts w:ascii="Malgun Gothic" w:cs="Malgun Gothic" w:eastAsia="Malgun Gothic" w:hAnsi="Malgun Gothic"/>
+                <w:b/>
+                <w:bCs/>
+                <w:color w:val="6E3A1C"/>
+                <w:sz w:val="19"/>
+                <w:szCs w:val="19"/>
+              </w:rPr>
+              <w:t xml:space="preserve">성능 실측 노트</w:t>
+            </w:r>
+          </w:p>
+        </w:tc>
+        <w:tc>
+          <w:tcPr>
+            <w:tcW w:type="dxa" w:w="5946"/>
+            <w:shd w:fill="FFFFFF" w:val="clear"/>
+            <w:tcMar>
+              <w:top w:type="dxa" w:w="80"/>
+              <w:left w:type="dxa" w:w="110"/>
+              <w:bottom w:type="dxa" w:w="80"/>
+              <w:right w:type="dxa" w:w="110"/>
+            </w:tcMar>
+            <w:vAlign w:val="center"/>
+          </w:tcPr>
+          <w:p>
+            <w:pPr>
+              <w:spacing w:line="290"/>
+              <w:jc w:val="left"/>
+            </w:pPr>
+            <w:r>
+              <w:rPr>
+                <w:rFonts w:ascii="Malgun Gothic" w:cs="Malgun Gothic" w:eastAsia="Malgun Gothic" w:hAnsi="Malgun Gothic"/>
+                <w:b w:val="false"/>
+                <w:bCs w:val="false"/>
+                <w:color w:val="2E241C"/>
+                <w:sz w:val="19"/>
+                <w:szCs w:val="19"/>
+              </w:rPr>
+              <w:t xml:space="preserve">ax-platform/docs/performance-notes.md</w:t>
             </w:r>
           </w:p>
         </w:tc>

</xml_diff>